<commit_message>
Update couple welcome-email guidelines attachment
Co-Authored-By: Claude Sonnet 5 <noreply@anthropic.com>
</commit_message>
<xml_diff>
--- a/assets/wedding-welcome-guidelines.docx
+++ b/assets/wedding-welcome-guidelines.docx
@@ -1,6 +1,6 @@
 
 <file path=word/document.xml><?xml version="1.0" encoding="utf-8"?>
-<w:document xmlns:wpc="http://schemas.microsoft.com/office/word/2010/wordprocessingCanvas" xmlns:cx="http://schemas.microsoft.com/office/drawing/2014/chartex" xmlns:cx1="http://schemas.microsoft.com/office/drawing/2015/9/8/chartex" xmlns:cx2="http://schemas.microsoft.com/office/drawing/2015/10/21/chartex" xmlns:cx3="http://schemas.microsoft.com/office/drawing/2016/5/9/chartex" xmlns:cx4="http://schemas.microsoft.com/office/drawing/2016/5/10/chartex" xmlns:cx5="http://schemas.microsoft.com/office/drawing/2016/5/11/chartex" xmlns:cx6="http://schemas.microsoft.com/office/drawing/2016/5/12/chartex" xmlns:cx7="http://schemas.microsoft.com/office/drawing/2016/5/13/chartex" xmlns:cx8="http://schemas.microsoft.com/office/drawing/2016/5/14/chartex" xmlns:mc="http://schemas.openxmlformats.org/markup-compatibility/2006" xmlns:aink="http://schemas.microsoft.com/office/drawing/2016/ink" xmlns:am3d="http://schemas.microsoft.com/office/drawing/2017/model3d" xmlns:o="urn:schemas-microsoft-com:office:office" xmlns:oel="http://schemas.microsoft.com/office/2019/extlst" xmlns:r="http://schemas.openxmlformats.org/officeDocument/2006/relationships" xmlns:m="http://schemas.openxmlformats.org/officeDocument/2006/math" xmlns:v="urn:schemas-microsoft-com:vml" xmlns:wp14="http://schemas.microsoft.com/office/word/2010/wordprocessingDrawing" xmlns:wp="http://schemas.openxmlformats.org/drawingml/2006/wordprocessingDrawing" xmlns:w10="urn:schemas-microsoft-com:office:word" xmlns:w="http://schemas.openxmlformats.org/wordprocessingml/2006/main" xmlns:w14="http://schemas.microsoft.com/office/word/2010/wordml" xmlns:w15="http://schemas.microsoft.com/office/word/2012/wordml" xmlns:w16cei="http://schemas.microsoft.com/office/word/2026/wordml/cei" xmlns:w16cex="http://schemas.microsoft.com/office/word/2018/wordml/cex" xmlns:w16cid="http://schemas.microsoft.com/office/word/2016/wordml/cid" xmlns:w16="http://schemas.microsoft.com/office/word/2018/wordml" xmlns:w16du="http://schemas.microsoft.com/office/word/2023/wordml/word16du" xmlns:w16sdtdh="http://schemas.microsoft.com/office/word/2020/wordml/sdtdatahash" xmlns:w16sdtfl="http://schemas.microsoft.com/office/word/2024/wordml/sdtformatlock" xmlns:w16se="http://schemas.microsoft.com/office/word/2015/wordml/symex" xmlns:wpg="http://schemas.microsoft.com/office/word/2010/wordprocessingGroup" xmlns:wpi="http://schemas.microsoft.com/office/word/2010/wordprocessingInk" xmlns:wne="http://schemas.microsoft.com/office/word/2006/wordml" xmlns:wps="http://schemas.microsoft.com/office/word/2010/wordprocessingShape" mc:Ignorable="w14 w15 w16se w16cid w16 w16cex w16sdtdh w16sdtfl w16du wp14">
+<w:document xmlns:wpc="http://schemas.microsoft.com/office/word/2010/wordprocessingCanvas" xmlns:cx="http://schemas.microsoft.com/office/drawing/2014/chartex" xmlns:cx1="http://schemas.microsoft.com/office/drawing/2015/9/8/chartex" xmlns:cx2="http://schemas.microsoft.com/office/drawing/2015/10/21/chartex" xmlns:cx3="http://schemas.microsoft.com/office/drawing/2016/5/9/chartex" xmlns:cx4="http://schemas.microsoft.com/office/drawing/2016/5/10/chartex" xmlns:cx5="http://schemas.microsoft.com/office/drawing/2016/5/11/chartex" xmlns:cx6="http://schemas.microsoft.com/office/drawing/2016/5/12/chartex" xmlns:cx7="http://schemas.microsoft.com/office/drawing/2016/5/13/chartex" xmlns:cx8="http://schemas.microsoft.com/office/drawing/2016/5/14/chartex" xmlns:mc="http://schemas.openxmlformats.org/markup-compatibility/2006" xmlns:aink="http://schemas.microsoft.com/office/drawing/2016/ink" xmlns:am3d="http://schemas.microsoft.com/office/drawing/2017/model3d" xmlns:o="urn:schemas-microsoft-com:office:office" xmlns:oel="http://schemas.microsoft.com/office/2019/extlst" xmlns:r="http://schemas.openxmlformats.org/officeDocument/2006/relationships" xmlns:m="http://schemas.openxmlformats.org/officeDocument/2006/math" xmlns:v="urn:schemas-microsoft-com:vml" xmlns:wp14="http://schemas.microsoft.com/office/word/2010/wordprocessingDrawing" xmlns:wp="http://schemas.openxmlformats.org/drawingml/2006/wordprocessingDrawing" xmlns:w10="urn:schemas-microsoft-com:office:word" xmlns:w="http://schemas.openxmlformats.org/wordprocessingml/2006/main" xmlns:w14="http://schemas.microsoft.com/office/word/2010/wordml" xmlns:w15="http://schemas.microsoft.com/office/word/2012/wordml" xmlns:w16cex="http://schemas.microsoft.com/office/word/2018/wordml/cex" xmlns:w16cid="http://schemas.microsoft.com/office/word/2016/wordml/cid" xmlns:w16="http://schemas.microsoft.com/office/word/2018/wordml" xmlns:w16du="http://schemas.microsoft.com/office/word/2023/wordml/word16du" xmlns:w16sdtdh="http://schemas.microsoft.com/office/word/2020/wordml/sdtdatahash" xmlns:w16sdtfl="http://schemas.microsoft.com/office/word/2024/wordml/sdtformatlock" xmlns:w16se="http://schemas.microsoft.com/office/word/2015/wordml/symex" xmlns:wpg="http://schemas.microsoft.com/office/word/2010/wordprocessingGroup" xmlns:wpi="http://schemas.microsoft.com/office/word/2010/wordprocessingInk" xmlns:wne="http://schemas.microsoft.com/office/word/2006/wordml" xmlns:wps="http://schemas.microsoft.com/office/word/2010/wordprocessingShape" mc:Ignorable="w14 w15 w16se w16cid w16 w16cex w16sdtdh w16sdtfl w16du wp14">
   <w:body>
     <w:p>
       <w:pPr>
@@ -638,16 +638,54 @@
           <w:szCs w:val="22"/>
           <w:rtl/>
         </w:rPr>
-        <w:t>אלכוהול במידה ומביאים באופן עצמאי סגור בקרטון עם שם ותאריך</w:t>
-      </w:r>
-      <w:r>
-        <w:rPr>
-          <w:rFonts w:ascii="Hadassah Friedlaender" w:hAnsi="Hadassah Friedlaender" w:cs="Hadassah Friedlaender" w:hint="cs"/>
-          <w:sz w:val="22"/>
-          <w:szCs w:val="22"/>
-          <w:rtl/>
-        </w:rPr>
-        <w:t>.</w:t>
+        <w:t>סרטי וידאו ומצגות הקרנה לצורך בדיקה, במידה ואתם מעוניינים להקרין חומרים שלכם באירוע</w:t>
+      </w:r>
+      <w:r>
+        <w:rPr>
+          <w:rFonts w:ascii="Hadassah Friedlaender" w:hAnsi="Hadassah Friedlaender" w:cs="Hadassah Friedlaender" w:hint="cs"/>
+          <w:sz w:val="22"/>
+          <w:szCs w:val="22"/>
+          <w:rtl/>
+        </w:rPr>
+        <w:t xml:space="preserve"> (על גבי דיסק און קי).</w:t>
+      </w:r>
+    </w:p>
+    <w:p>
+      <w:pPr>
+        <w:pStyle w:val="ListParagraph"/>
+        <w:rPr>
+          <w:rFonts w:ascii="Hadassah Friedlaender" w:hAnsi="Hadassah Friedlaender" w:cs="Hadassah Friedlaender"/>
+          <w:sz w:val="22"/>
+          <w:szCs w:val="22"/>
+        </w:rPr>
+      </w:pPr>
+    </w:p>
+    <w:p>
+      <w:pPr>
+        <w:rPr>
+          <w:rFonts w:ascii="Hadassah Friedlaender" w:hAnsi="Hadassah Friedlaender" w:cs="Hadassah Friedlaender"/>
+          <w:b/>
+          <w:bCs/>
+          <w:rtl/>
+        </w:rPr>
+      </w:pPr>
+      <w:r>
+        <w:rPr>
+          <w:rFonts w:ascii="Hadassah Friedlaender" w:hAnsi="Hadassah Friedlaender" w:cs="Hadassah Friedlaender" w:hint="cs"/>
+          <w:b/>
+          <w:bCs/>
+          <w:rtl/>
+        </w:rPr>
+        <w:t>ביום</w:t>
+      </w:r>
+      <w:r>
+        <w:rPr>
+          <w:rFonts w:ascii="Hadassah Friedlaender" w:hAnsi="Hadassah Friedlaender" w:cs="Hadassah Friedlaender"/>
+          <w:b/>
+          <w:bCs/>
+          <w:rtl/>
+        </w:rPr>
+        <w:t xml:space="preserve"> האירוע :</w:t>
       </w:r>
     </w:p>
     <w:p>
@@ -655,7 +693,7 @@
         <w:pStyle w:val="ListParagraph"/>
         <w:numPr>
           <w:ilvl w:val="0"/>
-          <w:numId w:val="2"/>
+          <w:numId w:val="4"/>
         </w:numPr>
         <w:rPr>
           <w:rFonts w:ascii="Hadassah Friedlaender" w:hAnsi="Hadassah Friedlaender" w:cs="Hadassah Friedlaender"/>
@@ -670,16 +708,16 @@
           <w:szCs w:val="22"/>
           <w:rtl/>
         </w:rPr>
-        <w:t>סרטי וידאו ומצגות הקרנה לצורך בדיקה, במידה ואתם מעוניינים להקרין חומרים שלכם באירוע</w:t>
-      </w:r>
-      <w:r>
-        <w:rPr>
-          <w:rFonts w:ascii="Hadassah Friedlaender" w:hAnsi="Hadassah Friedlaender" w:cs="Hadassah Friedlaender" w:hint="cs"/>
-          <w:sz w:val="22"/>
-          <w:szCs w:val="22"/>
-          <w:rtl/>
-        </w:rPr>
-        <w:t xml:space="preserve"> (על גבי דיסק און קי).</w:t>
+        <w:t>רשימות מוזמנים והושבה – לסיים באייפלן</w:t>
+      </w:r>
+      <w:r>
+        <w:rPr>
+          <w:rFonts w:ascii="Hadassah Friedlaender" w:hAnsi="Hadassah Friedlaender" w:cs="Hadassah Friedlaender" w:hint="cs"/>
+          <w:sz w:val="22"/>
+          <w:szCs w:val="22"/>
+          <w:rtl/>
+        </w:rPr>
+        <w:t>.</w:t>
       </w:r>
     </w:p>
     <w:p>
@@ -687,7 +725,7 @@
         <w:pStyle w:val="ListParagraph"/>
         <w:numPr>
           <w:ilvl w:val="0"/>
-          <w:numId w:val="2"/>
+          <w:numId w:val="4"/>
         </w:numPr>
         <w:rPr>
           <w:rFonts w:ascii="Hadassah Friedlaender" w:hAnsi="Hadassah Friedlaender" w:cs="Hadassah Friedlaender"/>
@@ -697,93 +735,53 @@
       </w:pPr>
       <w:r>
         <w:rPr>
-          <w:rFonts w:ascii="Hadassah Friedlaender" w:hAnsi="Hadassah Friedlaender" w:cs="Hadassah Friedlaender" w:hint="cs"/>
-          <w:sz w:val="22"/>
-          <w:szCs w:val="22"/>
-          <w:rtl/>
-        </w:rPr>
-        <w:t xml:space="preserve">אביזרים </w:t>
-      </w:r>
-      <w:r>
-        <w:rPr>
-          <w:rFonts w:ascii="Hadassah Friedlaender" w:hAnsi="Hadassah Friedlaender" w:cs="Hadassah Friedlaender"/>
-          <w:sz w:val="22"/>
-          <w:szCs w:val="22"/>
-          <w:rtl/>
-        </w:rPr>
-        <w:t>לרחבת הריקודים</w:t>
-      </w:r>
-      <w:r>
-        <w:rPr>
-          <w:rFonts w:ascii="Hadassah Friedlaender" w:hAnsi="Hadassah Friedlaender" w:cs="Hadassah Friedlaender" w:hint="cs"/>
-          <w:sz w:val="22"/>
-          <w:szCs w:val="22"/>
-          <w:rtl/>
-        </w:rPr>
-        <w:t xml:space="preserve"> (</w:t>
-      </w:r>
-      <w:r>
-        <w:rPr>
-          <w:rFonts w:ascii="Hadassah Friedlaender" w:hAnsi="Hadassah Friedlaender" w:cs="Hadassah Friedlaender" w:hint="cs"/>
-          <w:sz w:val="22"/>
-          <w:szCs w:val="22"/>
-          <w:rtl/>
-        </w:rPr>
-        <w:t>סלסלות</w:t>
-      </w:r>
-      <w:r>
-        <w:rPr>
-          <w:rFonts w:ascii="Hadassah Friedlaender" w:hAnsi="Hadassah Friedlaender" w:cs="Hadassah Friedlaender" w:hint="cs"/>
-          <w:sz w:val="22"/>
-          <w:szCs w:val="22"/>
-          <w:rtl/>
-        </w:rPr>
-        <w:t xml:space="preserve"> גומי, כפכפים, מניפות, הגיינה לשירותים וכו')</w:t>
-      </w:r>
-      <w:r>
-        <w:rPr>
-          <w:rFonts w:ascii="Hadassah Friedlaender" w:hAnsi="Hadassah Friedlaender" w:cs="Hadassah Friedlaender"/>
-          <w:sz w:val="22"/>
-          <w:szCs w:val="22"/>
-          <w:rtl/>
-        </w:rPr>
-        <w:t xml:space="preserve"> יש להביא בקרטון סגור</w:t>
-      </w:r>
-      <w:r>
-        <w:rPr>
-          <w:rFonts w:ascii="Hadassah Friedlaender" w:hAnsi="Hadassah Friedlaender" w:cs="Hadassah Friedlaender" w:hint="cs"/>
-          <w:sz w:val="22"/>
-          <w:szCs w:val="22"/>
-          <w:rtl/>
-        </w:rPr>
-        <w:t xml:space="preserve"> </w:t>
-      </w:r>
-      <w:r>
-        <w:rPr>
-          <w:rFonts w:ascii="Hadassah Friedlaender" w:hAnsi="Hadassah Friedlaender" w:cs="Hadassah Friedlaender"/>
-          <w:sz w:val="22"/>
-          <w:szCs w:val="22"/>
-          <w:rtl/>
-        </w:rPr>
-        <w:t xml:space="preserve">עם שם ותאריך </w:t>
-      </w:r>
-      <w:r>
-        <w:rPr>
-          <w:rFonts w:ascii="Hadassah Friedlaender" w:hAnsi="Hadassah Friedlaender" w:cs="Hadassah Friedlaender" w:hint="cs"/>
-          <w:sz w:val="22"/>
-          <w:szCs w:val="22"/>
-          <w:rtl/>
-        </w:rPr>
-        <w:t>האירוע</w:t>
-      </w:r>
-      <w:r>
-        <w:rPr>
-          <w:rFonts w:ascii="Hadassah Friedlaender" w:hAnsi="Hadassah Friedlaender" w:cs="Hadassah Friedlaender"/>
-          <w:sz w:val="22"/>
-          <w:szCs w:val="22"/>
-          <w:rtl/>
-        </w:rPr>
-        <w:t xml:space="preserve"> !</w:t>
+          <w:rFonts w:ascii="Hadassah Friedlaender" w:hAnsi="Hadassah Friedlaender" w:cs="Hadassah Friedlaender"/>
+          <w:sz w:val="22"/>
+          <w:szCs w:val="22"/>
+          <w:rtl/>
+        </w:rPr>
+        <w:t>אלכוהול במידה ומביאים באופן עצמאי סגור בקרטון עם שם ותאריך</w:t>
+      </w:r>
+      <w:r>
+        <w:rPr>
+          <w:rFonts w:ascii="Hadassah Friedlaender" w:hAnsi="Hadassah Friedlaender" w:cs="Hadassah Friedlaender" w:hint="cs"/>
+          <w:sz w:val="22"/>
+          <w:szCs w:val="22"/>
+          <w:rtl/>
+        </w:rPr>
+        <w:t>.</w:t>
+      </w:r>
+    </w:p>
+    <w:p>
+      <w:pPr>
+        <w:pStyle w:val="ListParagraph"/>
+        <w:numPr>
+          <w:ilvl w:val="0"/>
+          <w:numId w:val="4"/>
+        </w:numPr>
+        <w:rPr>
+          <w:rFonts w:ascii="Hadassah Friedlaender" w:hAnsi="Hadassah Friedlaender" w:cs="Hadassah Friedlaender"/>
+          <w:sz w:val="22"/>
+          <w:szCs w:val="22"/>
+        </w:rPr>
+      </w:pPr>
+      <w:r>
+        <w:rPr>
+          <w:rFonts w:ascii="Hadassah Friedlaender" w:hAnsi="Hadassah Friedlaender" w:cs="Hadassah Friedlaender"/>
+          <w:sz w:val="22"/>
+          <w:szCs w:val="22"/>
+          <w:rtl/>
+        </w:rPr>
+        <w:t>סרטי וידאו ומצגות הקרנה לצורך בדיקה, במידה ואתם מעוניינים להקרין חומרים שלכם באירוע</w:t>
+      </w:r>
+      <w:r>
+        <w:rPr>
+          <w:rFonts w:ascii="Hadassah Friedlaender" w:hAnsi="Hadassah Friedlaender" w:cs="Hadassah Friedlaender" w:hint="cs"/>
+          <w:sz w:val="22"/>
+          <w:szCs w:val="22"/>
+          <w:rtl/>
+        </w:rPr>
+        <w:t xml:space="preserve"> (על גבי דיסק און קי).</w:t>
       </w:r>
     </w:p>
     <w:p>
@@ -1117,26 +1115,6 @@
       <w:pPr>
         <w:rPr>
           <w:rFonts w:ascii="Hadassah Friedlaender" w:hAnsi="Hadassah Friedlaender" w:cs="Hadassah Friedlaender"/>
-          <w:b/>
-          <w:bCs/>
-          <w:rtl/>
-        </w:rPr>
-      </w:pPr>
-    </w:p>
-    <w:p>
-      <w:pPr>
-        <w:rPr>
-          <w:rFonts w:ascii="Hadassah Friedlaender" w:hAnsi="Hadassah Friedlaender" w:cs="Hadassah Friedlaender"/>
-          <w:b/>
-          <w:bCs/>
-          <w:rtl/>
-        </w:rPr>
-      </w:pPr>
-    </w:p>
-    <w:p>
-      <w:pPr>
-        <w:rPr>
-          <w:rFonts w:ascii="Hadassah Friedlaender" w:hAnsi="Hadassah Friedlaender" w:cs="Hadassah Friedlaender"/>
           <w:rtl/>
         </w:rPr>
       </w:pPr>
@@ -1170,14 +1148,30 @@
           <w:rFonts w:ascii="Hadassah Friedlaender" w:hAnsi="Hadassah Friedlaender" w:cs="Hadassah Friedlaender" w:hint="cs"/>
           <w:rtl/>
         </w:rPr>
-        <w:t>למערכת ה</w:t>
-      </w:r>
-      <w:r>
-        <w:rPr>
-          <w:rFonts w:ascii="Hadassah Friedlaender" w:hAnsi="Hadassah Friedlaender" w:cs="Hadassah Friedlaender"/>
-          <w:rtl/>
-        </w:rPr>
-        <w:t xml:space="preserve">אייפלן. </w:t>
+        <w:t xml:space="preserve">למערכת </w:t>
+      </w:r>
+      <w:proofErr w:type="spellStart"/>
+      <w:r>
+        <w:rPr>
+          <w:rFonts w:ascii="Hadassah Friedlaender" w:hAnsi="Hadassah Friedlaender" w:cs="Hadassah Friedlaender" w:hint="cs"/>
+          <w:rtl/>
+        </w:rPr>
+        <w:t>ה</w:t>
+      </w:r>
+      <w:r>
+        <w:rPr>
+          <w:rFonts w:ascii="Hadassah Friedlaender" w:hAnsi="Hadassah Friedlaender" w:cs="Hadassah Friedlaender"/>
+          <w:rtl/>
+        </w:rPr>
+        <w:t>אייפלן</w:t>
+      </w:r>
+      <w:proofErr w:type="spellEnd"/>
+      <w:r>
+        <w:rPr>
+          <w:rFonts w:ascii="Hadassah Friedlaender" w:hAnsi="Hadassah Friedlaender" w:cs="Hadassah Friedlaender"/>
+          <w:rtl/>
+        </w:rPr>
+        <w:t xml:space="preserve">. </w:t>
       </w:r>
     </w:p>
     <w:p>
@@ -1305,7 +1299,27 @@
           <w:bCs/>
           <w:rtl/>
         </w:rPr>
-        <w:t xml:space="preserve">לתשומת לבכם: לא יערכו מקומות לכמות העולה על </w:t>
+        <w:t xml:space="preserve">לתשומת </w:t>
+      </w:r>
+      <w:proofErr w:type="spellStart"/>
+      <w:r>
+        <w:rPr>
+          <w:rFonts w:ascii="Hadassah Friedlaender" w:hAnsi="Hadassah Friedlaender" w:cs="Hadassah Friedlaender"/>
+          <w:b/>
+          <w:bCs/>
+          <w:rtl/>
+        </w:rPr>
+        <w:t>לבכם</w:t>
+      </w:r>
+      <w:proofErr w:type="spellEnd"/>
+      <w:r>
+        <w:rPr>
+          <w:rFonts w:ascii="Hadassah Friedlaender" w:hAnsi="Hadassah Friedlaender" w:cs="Hadassah Friedlaender"/>
+          <w:b/>
+          <w:bCs/>
+          <w:rtl/>
+        </w:rPr>
+        <w:t xml:space="preserve">: לא יערכו מקומות לכמות העולה על </w:t>
       </w:r>
       <w:r>
         <w:rPr>
@@ -1530,6 +1544,22 @@
           <w:rtl/>
         </w:rPr>
         <w:t xml:space="preserve"> (אמור להיות כחלק מרשימת הספקים)</w:t>
+      </w:r>
+    </w:p>
+    <w:p>
+      <w:pPr>
+        <w:spacing w:after="0" w:line="240" w:lineRule="auto"/>
+        <w:rPr>
+          <w:rFonts w:ascii="Hadassah Friedlaender" w:hAnsi="Hadassah Friedlaender" w:cs="Hadassah Friedlaender"/>
+          <w:rtl/>
+        </w:rPr>
+      </w:pPr>
+      <w:r>
+        <w:rPr>
+          <w:rFonts w:ascii="Hadassah Friedlaender" w:hAnsi="Hadassah Friedlaender" w:cs="Hadassah Friedlaender" w:hint="cs"/>
+          <w:rtl/>
+        </w:rPr>
+        <w:t>כוס שבירה</w:t>
       </w:r>
     </w:p>
     <w:p>
@@ -1848,7 +1878,7 @@
 </file>
 
 <file path=word/endnotes.xml><?xml version="1.0" encoding="utf-8"?>
-<w:endnotes xmlns:wpc="http://schemas.microsoft.com/office/word/2010/wordprocessingCanvas" xmlns:cx="http://schemas.microsoft.com/office/drawing/2014/chartex" xmlns:cx1="http://schemas.microsoft.com/office/drawing/2015/9/8/chartex" xmlns:cx2="http://schemas.microsoft.com/office/drawing/2015/10/21/chartex" xmlns:cx3="http://schemas.microsoft.com/office/drawing/2016/5/9/chartex" xmlns:cx4="http://schemas.microsoft.com/office/drawing/2016/5/10/chartex" xmlns:cx5="http://schemas.microsoft.com/office/drawing/2016/5/11/chartex" xmlns:cx6="http://schemas.microsoft.com/office/drawing/2016/5/12/chartex" xmlns:cx7="http://schemas.microsoft.com/office/drawing/2016/5/13/chartex" xmlns:cx8="http://schemas.microsoft.com/office/drawing/2016/5/14/chartex" xmlns:mc="http://schemas.openxmlformats.org/markup-compatibility/2006" xmlns:aink="http://schemas.microsoft.com/office/drawing/2016/ink" xmlns:am3d="http://schemas.microsoft.com/office/drawing/2017/model3d" xmlns:o="urn:schemas-microsoft-com:office:office" xmlns:oel="http://schemas.microsoft.com/office/2019/extlst" xmlns:r="http://schemas.openxmlformats.org/officeDocument/2006/relationships" xmlns:m="http://schemas.openxmlformats.org/officeDocument/2006/math" xmlns:v="urn:schemas-microsoft-com:vml" xmlns:wp14="http://schemas.microsoft.com/office/word/2010/wordprocessingDrawing" xmlns:wp="http://schemas.openxmlformats.org/drawingml/2006/wordprocessingDrawing" xmlns:w10="urn:schemas-microsoft-com:office:word" xmlns:w="http://schemas.openxmlformats.org/wordprocessingml/2006/main" xmlns:w14="http://schemas.microsoft.com/office/word/2010/wordml" xmlns:w15="http://schemas.microsoft.com/office/word/2012/wordml" xmlns:w16cei="http://schemas.microsoft.com/office/word/2026/wordml/cei" xmlns:w16cex="http://schemas.microsoft.com/office/word/2018/wordml/cex" xmlns:w16cid="http://schemas.microsoft.com/office/word/2016/wordml/cid" xmlns:w16="http://schemas.microsoft.com/office/word/2018/wordml" xmlns:w16du="http://schemas.microsoft.com/office/word/2023/wordml/word16du" xmlns:w16sdtdh="http://schemas.microsoft.com/office/word/2020/wordml/sdtdatahash" xmlns:w16sdtfl="http://schemas.microsoft.com/office/word/2024/wordml/sdtformatlock" xmlns:w16se="http://schemas.microsoft.com/office/word/2015/wordml/symex" xmlns:wpg="http://schemas.microsoft.com/office/word/2010/wordprocessingGroup" xmlns:wpi="http://schemas.microsoft.com/office/word/2010/wordprocessingInk" xmlns:wne="http://schemas.microsoft.com/office/word/2006/wordml" xmlns:wps="http://schemas.microsoft.com/office/word/2010/wordprocessingShape" mc:Ignorable="w14 w15 w16se w16cid w16 w16cex w16sdtdh w16sdtfl w16du wp14">
+<w:endnotes xmlns:wpc="http://schemas.microsoft.com/office/word/2010/wordprocessingCanvas" xmlns:cx="http://schemas.microsoft.com/office/drawing/2014/chartex" xmlns:cx1="http://schemas.microsoft.com/office/drawing/2015/9/8/chartex" xmlns:cx2="http://schemas.microsoft.com/office/drawing/2015/10/21/chartex" xmlns:cx3="http://schemas.microsoft.com/office/drawing/2016/5/9/chartex" xmlns:cx4="http://schemas.microsoft.com/office/drawing/2016/5/10/chartex" xmlns:cx5="http://schemas.microsoft.com/office/drawing/2016/5/11/chartex" xmlns:cx6="http://schemas.microsoft.com/office/drawing/2016/5/12/chartex" xmlns:cx7="http://schemas.microsoft.com/office/drawing/2016/5/13/chartex" xmlns:cx8="http://schemas.microsoft.com/office/drawing/2016/5/14/chartex" xmlns:mc="http://schemas.openxmlformats.org/markup-compatibility/2006" xmlns:aink="http://schemas.microsoft.com/office/drawing/2016/ink" xmlns:am3d="http://schemas.microsoft.com/office/drawing/2017/model3d" xmlns:o="urn:schemas-microsoft-com:office:office" xmlns:oel="http://schemas.microsoft.com/office/2019/extlst" xmlns:r="http://schemas.openxmlformats.org/officeDocument/2006/relationships" xmlns:m="http://schemas.openxmlformats.org/officeDocument/2006/math" xmlns:v="urn:schemas-microsoft-com:vml" xmlns:wp14="http://schemas.microsoft.com/office/word/2010/wordprocessingDrawing" xmlns:wp="http://schemas.openxmlformats.org/drawingml/2006/wordprocessingDrawing" xmlns:w10="urn:schemas-microsoft-com:office:word" xmlns:w="http://schemas.openxmlformats.org/wordprocessingml/2006/main" xmlns:w14="http://schemas.microsoft.com/office/word/2010/wordml" xmlns:w15="http://schemas.microsoft.com/office/word/2012/wordml" xmlns:w16cex="http://schemas.microsoft.com/office/word/2018/wordml/cex" xmlns:w16cid="http://schemas.microsoft.com/office/word/2016/wordml/cid" xmlns:w16="http://schemas.microsoft.com/office/word/2018/wordml" xmlns:w16du="http://schemas.microsoft.com/office/word/2023/wordml/word16du" xmlns:w16sdtdh="http://schemas.microsoft.com/office/word/2020/wordml/sdtdatahash" xmlns:w16sdtfl="http://schemas.microsoft.com/office/word/2024/wordml/sdtformatlock" xmlns:w16se="http://schemas.microsoft.com/office/word/2015/wordml/symex" xmlns:wpg="http://schemas.microsoft.com/office/word/2010/wordprocessingGroup" xmlns:wpi="http://schemas.microsoft.com/office/word/2010/wordprocessingInk" xmlns:wne="http://schemas.microsoft.com/office/word/2006/wordml" xmlns:wps="http://schemas.microsoft.com/office/word/2010/wordprocessingShape" mc:Ignorable="w14 w15 w16se w16cid w16 w16cex w16sdtdh w16sdtfl w16du wp14">
   <w:endnote w:type="separator" w:id="-1">
     <w:p>
       <w:pPr>
@@ -1873,7 +1903,7 @@
 </file>
 
 <file path=word/footer1.xml><?xml version="1.0" encoding="utf-8"?>
-<w:ftr xmlns:wpc="http://schemas.microsoft.com/office/word/2010/wordprocessingCanvas" xmlns:cx="http://schemas.microsoft.com/office/drawing/2014/chartex" xmlns:cx1="http://schemas.microsoft.com/office/drawing/2015/9/8/chartex" xmlns:cx2="http://schemas.microsoft.com/office/drawing/2015/10/21/chartex" xmlns:cx3="http://schemas.microsoft.com/office/drawing/2016/5/9/chartex" xmlns:cx4="http://schemas.microsoft.com/office/drawing/2016/5/10/chartex" xmlns:cx5="http://schemas.microsoft.com/office/drawing/2016/5/11/chartex" xmlns:cx6="http://schemas.microsoft.com/office/drawing/2016/5/12/chartex" xmlns:cx7="http://schemas.microsoft.com/office/drawing/2016/5/13/chartex" xmlns:cx8="http://schemas.microsoft.com/office/drawing/2016/5/14/chartex" xmlns:mc="http://schemas.openxmlformats.org/markup-compatibility/2006" xmlns:aink="http://schemas.microsoft.com/office/drawing/2016/ink" xmlns:am3d="http://schemas.microsoft.com/office/drawing/2017/model3d" xmlns:o="urn:schemas-microsoft-com:office:office" xmlns:oel="http://schemas.microsoft.com/office/2019/extlst" xmlns:r="http://schemas.openxmlformats.org/officeDocument/2006/relationships" xmlns:m="http://schemas.openxmlformats.org/officeDocument/2006/math" xmlns:v="urn:schemas-microsoft-com:vml" xmlns:wp14="http://schemas.microsoft.com/office/word/2010/wordprocessingDrawing" xmlns:wp="http://schemas.openxmlformats.org/drawingml/2006/wordprocessingDrawing" xmlns:w10="urn:schemas-microsoft-com:office:word" xmlns:w="http://schemas.openxmlformats.org/wordprocessingml/2006/main" xmlns:w14="http://schemas.microsoft.com/office/word/2010/wordml" xmlns:w15="http://schemas.microsoft.com/office/word/2012/wordml" xmlns:w16cei="http://schemas.microsoft.com/office/word/2026/wordml/cei" xmlns:w16cex="http://schemas.microsoft.com/office/word/2018/wordml/cex" xmlns:w16cid="http://schemas.microsoft.com/office/word/2016/wordml/cid" xmlns:w16="http://schemas.microsoft.com/office/word/2018/wordml" xmlns:w16du="http://schemas.microsoft.com/office/word/2023/wordml/word16du" xmlns:w16sdtdh="http://schemas.microsoft.com/office/word/2020/wordml/sdtdatahash" xmlns:w16sdtfl="http://schemas.microsoft.com/office/word/2024/wordml/sdtformatlock" xmlns:w16se="http://schemas.microsoft.com/office/word/2015/wordml/symex" xmlns:wpg="http://schemas.microsoft.com/office/word/2010/wordprocessingGroup" xmlns:wpi="http://schemas.microsoft.com/office/word/2010/wordprocessingInk" xmlns:wne="http://schemas.microsoft.com/office/word/2006/wordml" xmlns:wps="http://schemas.microsoft.com/office/word/2010/wordprocessingShape" mc:Ignorable="w14 w15 w16se w16cid w16 w16cex w16sdtdh w16sdtfl w16du wp14">
+<w:ftr xmlns:wpc="http://schemas.microsoft.com/office/word/2010/wordprocessingCanvas" xmlns:cx="http://schemas.microsoft.com/office/drawing/2014/chartex" xmlns:cx1="http://schemas.microsoft.com/office/drawing/2015/9/8/chartex" xmlns:cx2="http://schemas.microsoft.com/office/drawing/2015/10/21/chartex" xmlns:cx3="http://schemas.microsoft.com/office/drawing/2016/5/9/chartex" xmlns:cx4="http://schemas.microsoft.com/office/drawing/2016/5/10/chartex" xmlns:cx5="http://schemas.microsoft.com/office/drawing/2016/5/11/chartex" xmlns:cx6="http://schemas.microsoft.com/office/drawing/2016/5/12/chartex" xmlns:cx7="http://schemas.microsoft.com/office/drawing/2016/5/13/chartex" xmlns:cx8="http://schemas.microsoft.com/office/drawing/2016/5/14/chartex" xmlns:mc="http://schemas.openxmlformats.org/markup-compatibility/2006" xmlns:aink="http://schemas.microsoft.com/office/drawing/2016/ink" xmlns:am3d="http://schemas.microsoft.com/office/drawing/2017/model3d" xmlns:o="urn:schemas-microsoft-com:office:office" xmlns:oel="http://schemas.microsoft.com/office/2019/extlst" xmlns:r="http://schemas.openxmlformats.org/officeDocument/2006/relationships" xmlns:m="http://schemas.openxmlformats.org/officeDocument/2006/math" xmlns:v="urn:schemas-microsoft-com:vml" xmlns:wp14="http://schemas.microsoft.com/office/word/2010/wordprocessingDrawing" xmlns:wp="http://schemas.openxmlformats.org/drawingml/2006/wordprocessingDrawing" xmlns:w10="urn:schemas-microsoft-com:office:word" xmlns:w="http://schemas.openxmlformats.org/wordprocessingml/2006/main" xmlns:w14="http://schemas.microsoft.com/office/word/2010/wordml" xmlns:w15="http://schemas.microsoft.com/office/word/2012/wordml" xmlns:w16cex="http://schemas.microsoft.com/office/word/2018/wordml/cex" xmlns:w16cid="http://schemas.microsoft.com/office/word/2016/wordml/cid" xmlns:w16="http://schemas.microsoft.com/office/word/2018/wordml" xmlns:w16du="http://schemas.microsoft.com/office/word/2023/wordml/word16du" xmlns:w16sdtdh="http://schemas.microsoft.com/office/word/2020/wordml/sdtdatahash" xmlns:w16sdtfl="http://schemas.microsoft.com/office/word/2024/wordml/sdtformatlock" xmlns:w16se="http://schemas.microsoft.com/office/word/2015/wordml/symex" xmlns:wpg="http://schemas.microsoft.com/office/word/2010/wordprocessingGroup" xmlns:wpi="http://schemas.microsoft.com/office/word/2010/wordprocessingInk" xmlns:wne="http://schemas.microsoft.com/office/word/2006/wordml" xmlns:wps="http://schemas.microsoft.com/office/word/2010/wordprocessingShape" mc:Ignorable="w14 w15 w16se w16cid w16 w16cex w16sdtdh w16sdtfl w16du wp14">
   <w:p>
     <w:pPr>
       <w:pStyle w:val="Footer"/>
@@ -1930,7 +1960,7 @@
 </file>
 
 <file path=word/footnotes.xml><?xml version="1.0" encoding="utf-8"?>
-<w:footnotes xmlns:wpc="http://schemas.microsoft.com/office/word/2010/wordprocessingCanvas" xmlns:cx="http://schemas.microsoft.com/office/drawing/2014/chartex" xmlns:cx1="http://schemas.microsoft.com/office/drawing/2015/9/8/chartex" xmlns:cx2="http://schemas.microsoft.com/office/drawing/2015/10/21/chartex" xmlns:cx3="http://schemas.microsoft.com/office/drawing/2016/5/9/chartex" xmlns:cx4="http://schemas.microsoft.com/office/drawing/2016/5/10/chartex" xmlns:cx5="http://schemas.microsoft.com/office/drawing/2016/5/11/chartex" xmlns:cx6="http://schemas.microsoft.com/office/drawing/2016/5/12/chartex" xmlns:cx7="http://schemas.microsoft.com/office/drawing/2016/5/13/chartex" xmlns:cx8="http://schemas.microsoft.com/office/drawing/2016/5/14/chartex" xmlns:mc="http://schemas.openxmlformats.org/markup-compatibility/2006" xmlns:aink="http://schemas.microsoft.com/office/drawing/2016/ink" xmlns:am3d="http://schemas.microsoft.com/office/drawing/2017/model3d" xmlns:o="urn:schemas-microsoft-com:office:office" xmlns:oel="http://schemas.microsoft.com/office/2019/extlst" xmlns:r="http://schemas.openxmlformats.org/officeDocument/2006/relationships" xmlns:m="http://schemas.openxmlformats.org/officeDocument/2006/math" xmlns:v="urn:schemas-microsoft-com:vml" xmlns:wp14="http://schemas.microsoft.com/office/word/2010/wordprocessingDrawing" xmlns:wp="http://schemas.openxmlformats.org/drawingml/2006/wordprocessingDrawing" xmlns:w10="urn:schemas-microsoft-com:office:word" xmlns:w="http://schemas.openxmlformats.org/wordprocessingml/2006/main" xmlns:w14="http://schemas.microsoft.com/office/word/2010/wordml" xmlns:w15="http://schemas.microsoft.com/office/word/2012/wordml" xmlns:w16cei="http://schemas.microsoft.com/office/word/2026/wordml/cei" xmlns:w16cex="http://schemas.microsoft.com/office/word/2018/wordml/cex" xmlns:w16cid="http://schemas.microsoft.com/office/word/2016/wordml/cid" xmlns:w16="http://schemas.microsoft.com/office/word/2018/wordml" xmlns:w16du="http://schemas.microsoft.com/office/word/2023/wordml/word16du" xmlns:w16sdtdh="http://schemas.microsoft.com/office/word/2020/wordml/sdtdatahash" xmlns:w16sdtfl="http://schemas.microsoft.com/office/word/2024/wordml/sdtformatlock" xmlns:w16se="http://schemas.microsoft.com/office/word/2015/wordml/symex" xmlns:wpg="http://schemas.microsoft.com/office/word/2010/wordprocessingGroup" xmlns:wpi="http://schemas.microsoft.com/office/word/2010/wordprocessingInk" xmlns:wne="http://schemas.microsoft.com/office/word/2006/wordml" xmlns:wps="http://schemas.microsoft.com/office/word/2010/wordprocessingShape" mc:Ignorable="w14 w15 w16se w16cid w16 w16cex w16sdtdh w16sdtfl w16du wp14">
+<w:footnotes xmlns:wpc="http://schemas.microsoft.com/office/word/2010/wordprocessingCanvas" xmlns:cx="http://schemas.microsoft.com/office/drawing/2014/chartex" xmlns:cx1="http://schemas.microsoft.com/office/drawing/2015/9/8/chartex" xmlns:cx2="http://schemas.microsoft.com/office/drawing/2015/10/21/chartex" xmlns:cx3="http://schemas.microsoft.com/office/drawing/2016/5/9/chartex" xmlns:cx4="http://schemas.microsoft.com/office/drawing/2016/5/10/chartex" xmlns:cx5="http://schemas.microsoft.com/office/drawing/2016/5/11/chartex" xmlns:cx6="http://schemas.microsoft.com/office/drawing/2016/5/12/chartex" xmlns:cx7="http://schemas.microsoft.com/office/drawing/2016/5/13/chartex" xmlns:cx8="http://schemas.microsoft.com/office/drawing/2016/5/14/chartex" xmlns:mc="http://schemas.openxmlformats.org/markup-compatibility/2006" xmlns:aink="http://schemas.microsoft.com/office/drawing/2016/ink" xmlns:am3d="http://schemas.microsoft.com/office/drawing/2017/model3d" xmlns:o="urn:schemas-microsoft-com:office:office" xmlns:oel="http://schemas.microsoft.com/office/2019/extlst" xmlns:r="http://schemas.openxmlformats.org/officeDocument/2006/relationships" xmlns:m="http://schemas.openxmlformats.org/officeDocument/2006/math" xmlns:v="urn:schemas-microsoft-com:vml" xmlns:wp14="http://schemas.microsoft.com/office/word/2010/wordprocessingDrawing" xmlns:wp="http://schemas.openxmlformats.org/drawingml/2006/wordprocessingDrawing" xmlns:w10="urn:schemas-microsoft-com:office:word" xmlns:w="http://schemas.openxmlformats.org/wordprocessingml/2006/main" xmlns:w14="http://schemas.microsoft.com/office/word/2010/wordml" xmlns:w15="http://schemas.microsoft.com/office/word/2012/wordml" xmlns:w16cex="http://schemas.microsoft.com/office/word/2018/wordml/cex" xmlns:w16cid="http://schemas.microsoft.com/office/word/2016/wordml/cid" xmlns:w16="http://schemas.microsoft.com/office/word/2018/wordml" xmlns:w16du="http://schemas.microsoft.com/office/word/2023/wordml/word16du" xmlns:w16sdtdh="http://schemas.microsoft.com/office/word/2020/wordml/sdtdatahash" xmlns:w16sdtfl="http://schemas.microsoft.com/office/word/2024/wordml/sdtformatlock" xmlns:w16se="http://schemas.microsoft.com/office/word/2015/wordml/symex" xmlns:wpg="http://schemas.microsoft.com/office/word/2010/wordprocessingGroup" xmlns:wpi="http://schemas.microsoft.com/office/word/2010/wordprocessingInk" xmlns:wne="http://schemas.microsoft.com/office/word/2006/wordml" xmlns:wps="http://schemas.microsoft.com/office/word/2010/wordprocessingShape" mc:Ignorable="w14 w15 w16se w16cid w16 w16cex w16sdtdh w16sdtfl w16du wp14">
   <w:footnote w:type="separator" w:id="-1">
     <w:p>
       <w:pPr>
@@ -1955,7 +1985,7 @@
 </file>
 
 <file path=word/header1.xml><?xml version="1.0" encoding="utf-8"?>
-<w:hdr xmlns:wpc="http://schemas.microsoft.com/office/word/2010/wordprocessingCanvas" xmlns:cx="http://schemas.microsoft.com/office/drawing/2014/chartex" xmlns:cx1="http://schemas.microsoft.com/office/drawing/2015/9/8/chartex" xmlns:cx2="http://schemas.microsoft.com/office/drawing/2015/10/21/chartex" xmlns:cx3="http://schemas.microsoft.com/office/drawing/2016/5/9/chartex" xmlns:cx4="http://schemas.microsoft.com/office/drawing/2016/5/10/chartex" xmlns:cx5="http://schemas.microsoft.com/office/drawing/2016/5/11/chartex" xmlns:cx6="http://schemas.microsoft.com/office/drawing/2016/5/12/chartex" xmlns:cx7="http://schemas.microsoft.com/office/drawing/2016/5/13/chartex" xmlns:cx8="http://schemas.microsoft.com/office/drawing/2016/5/14/chartex" xmlns:mc="http://schemas.openxmlformats.org/markup-compatibility/2006" xmlns:aink="http://schemas.microsoft.com/office/drawing/2016/ink" xmlns:am3d="http://schemas.microsoft.com/office/drawing/2017/model3d" xmlns:o="urn:schemas-microsoft-com:office:office" xmlns:oel="http://schemas.microsoft.com/office/2019/extlst" xmlns:r="http://schemas.openxmlformats.org/officeDocument/2006/relationships" xmlns:m="http://schemas.openxmlformats.org/officeDocument/2006/math" xmlns:v="urn:schemas-microsoft-com:vml" xmlns:wp14="http://schemas.microsoft.com/office/word/2010/wordprocessingDrawing" xmlns:wp="http://schemas.openxmlformats.org/drawingml/2006/wordprocessingDrawing" xmlns:w10="urn:schemas-microsoft-com:office:word" xmlns:w="http://schemas.openxmlformats.org/wordprocessingml/2006/main" xmlns:w14="http://schemas.microsoft.com/office/word/2010/wordml" xmlns:w15="http://schemas.microsoft.com/office/word/2012/wordml" xmlns:w16cei="http://schemas.microsoft.com/office/word/2026/wordml/cei" xmlns:w16cex="http://schemas.microsoft.com/office/word/2018/wordml/cex" xmlns:w16cid="http://schemas.microsoft.com/office/word/2016/wordml/cid" xmlns:w16="http://schemas.microsoft.com/office/word/2018/wordml" xmlns:w16du="http://schemas.microsoft.com/office/word/2023/wordml/word16du" xmlns:w16sdtdh="http://schemas.microsoft.com/office/word/2020/wordml/sdtdatahash" xmlns:w16sdtfl="http://schemas.microsoft.com/office/word/2024/wordml/sdtformatlock" xmlns:w16se="http://schemas.microsoft.com/office/word/2015/wordml/symex" xmlns:wpg="http://schemas.microsoft.com/office/word/2010/wordprocessingGroup" xmlns:wpi="http://schemas.microsoft.com/office/word/2010/wordprocessingInk" xmlns:wne="http://schemas.microsoft.com/office/word/2006/wordml" xmlns:wps="http://schemas.microsoft.com/office/word/2010/wordprocessingShape" mc:Ignorable="w14 w15 w16se w16cid w16 w16cex w16sdtdh w16sdtfl w16du wp14">
+<w:hdr xmlns:wpc="http://schemas.microsoft.com/office/word/2010/wordprocessingCanvas" xmlns:cx="http://schemas.microsoft.com/office/drawing/2014/chartex" xmlns:cx1="http://schemas.microsoft.com/office/drawing/2015/9/8/chartex" xmlns:cx2="http://schemas.microsoft.com/office/drawing/2015/10/21/chartex" xmlns:cx3="http://schemas.microsoft.com/office/drawing/2016/5/9/chartex" xmlns:cx4="http://schemas.microsoft.com/office/drawing/2016/5/10/chartex" xmlns:cx5="http://schemas.microsoft.com/office/drawing/2016/5/11/chartex" xmlns:cx6="http://schemas.microsoft.com/office/drawing/2016/5/12/chartex" xmlns:cx7="http://schemas.microsoft.com/office/drawing/2016/5/13/chartex" xmlns:cx8="http://schemas.microsoft.com/office/drawing/2016/5/14/chartex" xmlns:mc="http://schemas.openxmlformats.org/markup-compatibility/2006" xmlns:aink="http://schemas.microsoft.com/office/drawing/2016/ink" xmlns:am3d="http://schemas.microsoft.com/office/drawing/2017/model3d" xmlns:o="urn:schemas-microsoft-com:office:office" xmlns:oel="http://schemas.microsoft.com/office/2019/extlst" xmlns:r="http://schemas.openxmlformats.org/officeDocument/2006/relationships" xmlns:m="http://schemas.openxmlformats.org/officeDocument/2006/math" xmlns:v="urn:schemas-microsoft-com:vml" xmlns:wp14="http://schemas.microsoft.com/office/word/2010/wordprocessingDrawing" xmlns:wp="http://schemas.openxmlformats.org/drawingml/2006/wordprocessingDrawing" xmlns:w10="urn:schemas-microsoft-com:office:word" xmlns:w="http://schemas.openxmlformats.org/wordprocessingml/2006/main" xmlns:w14="http://schemas.microsoft.com/office/word/2010/wordml" xmlns:w15="http://schemas.microsoft.com/office/word/2012/wordml" xmlns:w16cex="http://schemas.microsoft.com/office/word/2018/wordml/cex" xmlns:w16cid="http://schemas.microsoft.com/office/word/2016/wordml/cid" xmlns:w16="http://schemas.microsoft.com/office/word/2018/wordml" xmlns:w16du="http://schemas.microsoft.com/office/word/2023/wordml/word16du" xmlns:w16sdtdh="http://schemas.microsoft.com/office/word/2020/wordml/sdtdatahash" xmlns:w16sdtfl="http://schemas.microsoft.com/office/word/2024/wordml/sdtformatlock" xmlns:w16se="http://schemas.microsoft.com/office/word/2015/wordml/symex" xmlns:wpg="http://schemas.microsoft.com/office/word/2010/wordprocessingGroup" xmlns:wpi="http://schemas.microsoft.com/office/word/2010/wordprocessingInk" xmlns:wne="http://schemas.microsoft.com/office/word/2006/wordml" xmlns:wps="http://schemas.microsoft.com/office/word/2010/wordprocessingShape" mc:Ignorable="w14 w15 w16se w16cid w16 w16cex w16sdtdh w16sdtfl w16du wp14">
   <w:p>
     <w:pPr>
       <w:pStyle w:val="Header"/>
@@ -2012,7 +2042,7 @@
 </file>
 
 <file path=word/numbering.xml><?xml version="1.0" encoding="utf-8"?>
-<w:numbering xmlns:wpc="http://schemas.microsoft.com/office/word/2010/wordprocessingCanvas" xmlns:cx="http://schemas.microsoft.com/office/drawing/2014/chartex" xmlns:cx1="http://schemas.microsoft.com/office/drawing/2015/9/8/chartex" xmlns:cx2="http://schemas.microsoft.com/office/drawing/2015/10/21/chartex" xmlns:cx3="http://schemas.microsoft.com/office/drawing/2016/5/9/chartex" xmlns:cx4="http://schemas.microsoft.com/office/drawing/2016/5/10/chartex" xmlns:cx5="http://schemas.microsoft.com/office/drawing/2016/5/11/chartex" xmlns:cx6="http://schemas.microsoft.com/office/drawing/2016/5/12/chartex" xmlns:cx7="http://schemas.microsoft.com/office/drawing/2016/5/13/chartex" xmlns:cx8="http://schemas.microsoft.com/office/drawing/2016/5/14/chartex" xmlns:mc="http://schemas.openxmlformats.org/markup-compatibility/2006" xmlns:aink="http://schemas.microsoft.com/office/drawing/2016/ink" xmlns:am3d="http://schemas.microsoft.com/office/drawing/2017/model3d" xmlns:o="urn:schemas-microsoft-com:office:office" xmlns:oel="http://schemas.microsoft.com/office/2019/extlst" xmlns:r="http://schemas.openxmlformats.org/officeDocument/2006/relationships" xmlns:m="http://schemas.openxmlformats.org/officeDocument/2006/math" xmlns:v="urn:schemas-microsoft-com:vml" xmlns:wp14="http://schemas.microsoft.com/office/word/2010/wordprocessingDrawing" xmlns:wp="http://schemas.openxmlformats.org/drawingml/2006/wordprocessingDrawing" xmlns:w10="urn:schemas-microsoft-com:office:word" xmlns:w="http://schemas.openxmlformats.org/wordprocessingml/2006/main" xmlns:w14="http://schemas.microsoft.com/office/word/2010/wordml" xmlns:w15="http://schemas.microsoft.com/office/word/2012/wordml" xmlns:w16cei="http://schemas.microsoft.com/office/word/2026/wordml/cei" xmlns:w16cex="http://schemas.microsoft.com/office/word/2018/wordml/cex" xmlns:w16cid="http://schemas.microsoft.com/office/word/2016/wordml/cid" xmlns:w16="http://schemas.microsoft.com/office/word/2018/wordml" xmlns:w16du="http://schemas.microsoft.com/office/word/2023/wordml/word16du" xmlns:w16sdtdh="http://schemas.microsoft.com/office/word/2020/wordml/sdtdatahash" xmlns:w16sdtfl="http://schemas.microsoft.com/office/word/2024/wordml/sdtformatlock" xmlns:w16se="http://schemas.microsoft.com/office/word/2015/wordml/symex" xmlns:wpg="http://schemas.microsoft.com/office/word/2010/wordprocessingGroup" xmlns:wpi="http://schemas.microsoft.com/office/word/2010/wordprocessingInk" xmlns:wne="http://schemas.microsoft.com/office/word/2006/wordml" xmlns:wps="http://schemas.microsoft.com/office/word/2010/wordprocessingShape" mc:Ignorable="w14 w15 w16se w16cid w16 w16cex w16sdtdh w16sdtfl w16du wp14">
+<w:numbering xmlns:wpc="http://schemas.microsoft.com/office/word/2010/wordprocessingCanvas" xmlns:cx="http://schemas.microsoft.com/office/drawing/2014/chartex" xmlns:cx1="http://schemas.microsoft.com/office/drawing/2015/9/8/chartex" xmlns:cx2="http://schemas.microsoft.com/office/drawing/2015/10/21/chartex" xmlns:cx3="http://schemas.microsoft.com/office/drawing/2016/5/9/chartex" xmlns:cx4="http://schemas.microsoft.com/office/drawing/2016/5/10/chartex" xmlns:cx5="http://schemas.microsoft.com/office/drawing/2016/5/11/chartex" xmlns:cx6="http://schemas.microsoft.com/office/drawing/2016/5/12/chartex" xmlns:cx7="http://schemas.microsoft.com/office/drawing/2016/5/13/chartex" xmlns:cx8="http://schemas.microsoft.com/office/drawing/2016/5/14/chartex" xmlns:mc="http://schemas.openxmlformats.org/markup-compatibility/2006" xmlns:aink="http://schemas.microsoft.com/office/drawing/2016/ink" xmlns:am3d="http://schemas.microsoft.com/office/drawing/2017/model3d" xmlns:o="urn:schemas-microsoft-com:office:office" xmlns:oel="http://schemas.microsoft.com/office/2019/extlst" xmlns:r="http://schemas.openxmlformats.org/officeDocument/2006/relationships" xmlns:m="http://schemas.openxmlformats.org/officeDocument/2006/math" xmlns:v="urn:schemas-microsoft-com:vml" xmlns:wp14="http://schemas.microsoft.com/office/word/2010/wordprocessingDrawing" xmlns:wp="http://schemas.openxmlformats.org/drawingml/2006/wordprocessingDrawing" xmlns:w10="urn:schemas-microsoft-com:office:word" xmlns:w="http://schemas.openxmlformats.org/wordprocessingml/2006/main" xmlns:w14="http://schemas.microsoft.com/office/word/2010/wordml" xmlns:w15="http://schemas.microsoft.com/office/word/2012/wordml" xmlns:w16cex="http://schemas.microsoft.com/office/word/2018/wordml/cex" xmlns:w16cid="http://schemas.microsoft.com/office/word/2016/wordml/cid" xmlns:w16="http://schemas.microsoft.com/office/word/2018/wordml" xmlns:w16du="http://schemas.microsoft.com/office/word/2023/wordml/word16du" xmlns:w16sdtdh="http://schemas.microsoft.com/office/word/2020/wordml/sdtdatahash" xmlns:w16sdtfl="http://schemas.microsoft.com/office/word/2024/wordml/sdtformatlock" xmlns:w16se="http://schemas.microsoft.com/office/word/2015/wordml/symex" xmlns:wpg="http://schemas.microsoft.com/office/word/2010/wordprocessingGroup" xmlns:wpi="http://schemas.microsoft.com/office/word/2010/wordprocessingInk" xmlns:wne="http://schemas.microsoft.com/office/word/2006/wordml" xmlns:wps="http://schemas.microsoft.com/office/word/2010/wordprocessingShape" mc:Ignorable="w14 w15 w16se w16cid w16 w16cex w16sdtdh w16sdtfl w16du wp14">
   <w:abstractNum w:abstractNumId="0" w15:restartNumberingAfterBreak="0">
     <w:nsid w:val="15EA6156"/>
     <w:multiLevelType w:val="hybridMultilevel"/>
@@ -2295,6 +2325,95 @@
       </w:pPr>
     </w:lvl>
     <w:lvl w:ilvl="8" w:tplc="0409001B" w:tentative="1">
+      <w:start w:val="1"/>
+      <w:numFmt w:val="lowerRoman"/>
+      <w:lvlText w:val="%9."/>
+      <w:lvlJc w:val="right"/>
+      <w:pPr>
+        <w:ind w:left="6480" w:hanging="180"/>
+      </w:pPr>
+    </w:lvl>
+  </w:abstractNum>
+  <w:abstractNum w:abstractNumId="3" w15:restartNumberingAfterBreak="0">
+    <w:nsid w:val="7D1A2C06"/>
+    <w:multiLevelType w:val="hybridMultilevel"/>
+    <w:tmpl w:val="D3A612DE"/>
+    <w:lvl w:ilvl="0" w:tplc="FFFFFFFF">
+      <w:start w:val="1"/>
+      <w:numFmt w:val="decimal"/>
+      <w:lvlText w:val="%1."/>
+      <w:lvlJc w:val="left"/>
+      <w:pPr>
+        <w:ind w:left="720" w:hanging="360"/>
+      </w:pPr>
+      <w:rPr>
+        <w:rFonts w:hint="default"/>
+      </w:rPr>
+    </w:lvl>
+    <w:lvl w:ilvl="1" w:tplc="FFFFFFFF" w:tentative="1">
+      <w:start w:val="1"/>
+      <w:numFmt w:val="lowerLetter"/>
+      <w:lvlText w:val="%2."/>
+      <w:lvlJc w:val="left"/>
+      <w:pPr>
+        <w:ind w:left="1440" w:hanging="360"/>
+      </w:pPr>
+    </w:lvl>
+    <w:lvl w:ilvl="2" w:tplc="FFFFFFFF" w:tentative="1">
+      <w:start w:val="1"/>
+      <w:numFmt w:val="lowerRoman"/>
+      <w:lvlText w:val="%3."/>
+      <w:lvlJc w:val="right"/>
+      <w:pPr>
+        <w:ind w:left="2160" w:hanging="180"/>
+      </w:pPr>
+    </w:lvl>
+    <w:lvl w:ilvl="3" w:tplc="FFFFFFFF" w:tentative="1">
+      <w:start w:val="1"/>
+      <w:numFmt w:val="decimal"/>
+      <w:lvlText w:val="%4."/>
+      <w:lvlJc w:val="left"/>
+      <w:pPr>
+        <w:ind w:left="2880" w:hanging="360"/>
+      </w:pPr>
+    </w:lvl>
+    <w:lvl w:ilvl="4" w:tplc="FFFFFFFF" w:tentative="1">
+      <w:start w:val="1"/>
+      <w:numFmt w:val="lowerLetter"/>
+      <w:lvlText w:val="%5."/>
+      <w:lvlJc w:val="left"/>
+      <w:pPr>
+        <w:ind w:left="3600" w:hanging="360"/>
+      </w:pPr>
+    </w:lvl>
+    <w:lvl w:ilvl="5" w:tplc="FFFFFFFF" w:tentative="1">
+      <w:start w:val="1"/>
+      <w:numFmt w:val="lowerRoman"/>
+      <w:lvlText w:val="%6."/>
+      <w:lvlJc w:val="right"/>
+      <w:pPr>
+        <w:ind w:left="4320" w:hanging="180"/>
+      </w:pPr>
+    </w:lvl>
+    <w:lvl w:ilvl="6" w:tplc="FFFFFFFF" w:tentative="1">
+      <w:start w:val="1"/>
+      <w:numFmt w:val="decimal"/>
+      <w:lvlText w:val="%7."/>
+      <w:lvlJc w:val="left"/>
+      <w:pPr>
+        <w:ind w:left="5040" w:hanging="360"/>
+      </w:pPr>
+    </w:lvl>
+    <w:lvl w:ilvl="7" w:tplc="FFFFFFFF" w:tentative="1">
+      <w:start w:val="1"/>
+      <w:numFmt w:val="lowerLetter"/>
+      <w:lvlText w:val="%8."/>
+      <w:lvlJc w:val="left"/>
+      <w:pPr>
+        <w:ind w:left="5760" w:hanging="360"/>
+      </w:pPr>
+    </w:lvl>
+    <w:lvl w:ilvl="8" w:tplc="FFFFFFFF" w:tentative="1">
       <w:start w:val="1"/>
       <w:numFmt w:val="lowerRoman"/>
       <w:lvlText w:val="%9."/>
@@ -2312,6 +2431,9 @@
   </w:num>
   <w:num w:numId="3" w16cid:durableId="507016814">
     <w:abstractNumId w:val="1"/>
+  </w:num>
+  <w:num w:numId="4" w16cid:durableId="244192931">
+    <w:abstractNumId w:val="3"/>
   </w:num>
 </w:numbering>
 </file>

</xml_diff>